<commit_message>
Update paper: 4 authors dari ITS Surabaya + CRediT split
Authors (urutan):
1. Ananta Dwi Prayoga Alwy (6025252008) - corresponding author *
2. Dhayu Intan Nareswari (6025252005)
3. Mahathir Muhammad (6025252008)
4. Obi Kastanya (6025252015)

Shared affiliation:
- Department of Informatics
- Faculty of Intelligent Electrical and Informatics Technology
- Institut Teknologi Sepuluh Nopember (ITS), Surabaya, Indonesia

CRediT Authorship Contribution dipecah per author dengan kombinasi role
yang masuk akal (Conceptualization, Methodology, Software, Validation,
Investigation, Formal analysis, Data curation, Visualization, Supervision,
Writing original/review).

Acknowledgments diupdate untuk mention ITS + program Master's Informatika.

Catatan: NRP Ananta dan Mahathir sama (6025252008) - kemungkinan typo
di input user, perlu dicek.
</commit_message>
<xml_diff>
--- a/kk-ngebut_paper.docx
+++ b/kk-ngebut_paper.docx
@@ -42,7 +42,7 @@
           <w:i w:val="0"/>
           <w:sz w:val="22"/>
         </w:rPr>
-        <w:t>Mahathir Muhammad 1,*)</w:t>
+        <w:t>Ananta Dwi Prayoga Alwy 1,*), Dhayu Intan Nareswari 2), Mahathir Muhammad 3), and Obi Kastanya 4)</w:t>
       </w:r>
     </w:p>
     <w:p>
@@ -57,7 +57,7 @@
           <w:i/>
           <w:sz w:val="20"/>
         </w:rPr>
-        <w:t>1) Master Program in Computational Intelligence, [University Name], [City], Indonesia</w:t>
+        <w:t>1, 2, 3, 4) Department of Informatics, Faculty of Intelligent Electrical and Informatics Technology</w:t>
       </w:r>
     </w:p>
     <w:p>
@@ -69,10 +69,10 @@
         <w:rPr>
           <w:rFonts w:ascii="Times New Roman" w:hAnsi="Times New Roman" w:eastAsia="Times New Roman" w:cs="Times New Roman"/>
           <w:b w:val="0"/>
-          <w:i w:val="0"/>
-          <w:sz w:val="20"/>
-        </w:rPr>
-        <w:t>E-mail: mahathirmuhammad02@gmail.com 1)</w:t>
+          <w:i/>
+          <w:sz w:val="20"/>
+        </w:rPr>
+        <w:t>Institut Teknologi Sepuluh Nopember, Surabaya, Indonesia</w:t>
       </w:r>
     </w:p>
     <w:p>
@@ -87,6 +87,7 @@
           <w:i w:val="0"/>
           <w:sz w:val="20"/>
         </w:rPr>
+        <w:t>E-mail: 6025252008@student.its.ac.id 1), 6025252005@student.its.ac.id 2), 6025252008@student.its.ac.id 3), and 6025252015@student.its.ac.id 4)</w:t>
       </w:r>
     </w:p>
     <w:p>
@@ -111,6 +112,20 @@
       <w:r>
         <w:rPr>
           <w:rFonts w:ascii="Times New Roman" w:hAnsi="Times New Roman" w:eastAsia="Times New Roman" w:cs="Times New Roman"/>
+          <w:b w:val="0"/>
+          <w:i w:val="0"/>
+          <w:sz w:val="20"/>
+        </w:rPr>
+      </w:r>
+    </w:p>
+    <w:p>
+      <w:pPr>
+        <w:spacing w:after="0" w:before="0"/>
+        <w:jc w:val="center"/>
+      </w:pPr>
+      <w:r>
+        <w:rPr>
+          <w:rFonts w:ascii="Times New Roman" w:hAnsi="Times New Roman" w:eastAsia="Times New Roman" w:cs="Times New Roman"/>
           <w:b/>
           <w:i w:val="0"/>
           <w:sz w:val="20"/>
@@ -607,7 +622,7 @@
           <w:i w:val="0"/>
           <w:sz w:val="20"/>
         </w:rPr>
-        <w:t>API calls used temperature=0.3 and response_format='json_object' to enforce structured output. Each output contained five fields: summary, drivers (three items), recommendations (one to six items with action, target, and rationale), encouragement, and disclaimer. Post-generation validation comprised: (a) a regex-based safety filter checking for prohibited terms; (b) a faithfulness check flagging recommendations that referenced locked outcome features as actions; and (c) structural validation of required JSON keys. Outputs failing any check triggered up to three retry attempts before falling back to a dummy placeholder.</w:t>
+        <w:t>API calls used temperature=0.3 and response_format='json_object' to enforce structured output. Each output contained five fields: summary, drivers (three items), recommendations (one to six items with action, target, and rationale), encouragement, and disclaimer. Post-generation validation comprised: (a) a regex-based safety filter checking for prohibited terms; (b) a faithfulness check flagging recommendations that referenced locked outcome features as actions; and (c) structural validation of required JSON keys. Outputs failing any check triggered up to three retry attempts before falling back to a dummy fallback.</w:t>
       </w:r>
     </w:p>
     <w:p>
@@ -2371,7 +2386,7 @@
           <w:i w:val="0"/>
           <w:sz w:val="20"/>
         </w:rPr>
-        <w:t>Mahathir Muhammad: Conceptualization, Methodology, Software, Validation, Formal analysis, Investigation, Data curation, Writing – original draft, Writing – review &amp; editing, Visualization.</w:t>
+        <w:t>Ananta Dwi Prayoga Alwy: Conceptualization, Methodology, Software, Validation, Writing – original draft. Dhayu Intan Nareswari: Conceptualization, Investigation, Formal analysis, Writing – review &amp; editing. Mahathir Muhammad: Software, Data curation, Formal analysis, Visualization, Writing – review &amp; editing. Obi Kastanya: Conceptualization, Supervision, Writing – review &amp; editing, Validation. All authors have read and agreed to the published version of the manuscript.</w:t>
       </w:r>
     </w:p>
     <w:p>
@@ -2429,7 +2444,7 @@
           <w:i w:val="0"/>
           <w:sz w:val="20"/>
         </w:rPr>
-        <w:t>This work was conducted as part of the Master's program in Computational Intelligence. The author thanks the Kaggle community for making the Sleep Health and Daily Performance dataset publicly available.</w:t>
+        <w:t>This work was conducted as part of the Master's program in Informatics at the Department of Informatics, Faculty of Intelligent Electrical and Informatics Technology, Institut Teknologi Sepuluh Nopember (ITS), Surabaya. The authors thank the Kaggle community for making the Sleep Health and Daily Performance dataset publicly available.</w:t>
       </w:r>
     </w:p>
     <w:p>

</xml_diff>